<commit_message>
Add GitHub artifact links
Co-authored-by: Copilot <223556219+Copilot@users.noreply.github.com>
</commit_message>
<xml_diff>
--- a/DEMO-INSTRUCTIONS.docx
+++ b/DEMO-INSTRUCTIONS.docx
@@ -649,6 +649,224 @@
         <w:t>Delete generated analysis outputs from the tenant after the private delivery if they are no longer needed. Do not add customer confidential information to these public sample files.</w:t>
       </w:r>
     </w:p>
+    <w:p>
+      <w:r>
+        <w:br w:type="page"/>
+      </w:r>
+    </w:p>
+    <w:p>
+      <w:pPr>
+        <w:pStyle w:val="Heading1"/>
+      </w:pPr>
+      <w:r>
+        <w:t>GitHub artifact links</w:t>
+      </w:r>
+    </w:p>
+    <w:p>
+      <w:r>
+        <w:t>Repository: https://github.com/AndrewConniff/GuitarSales</w:t>
+      </w:r>
+    </w:p>
+    <w:p>
+      <w:pPr>
+        <w:pStyle w:val="ListBullet"/>
+      </w:pPr>
+      <w:r>
+        <w:t>AI-CONTENT-DECLARATION.md: https://github.com/AndrewConniff/GuitarSales/blob/main/AI-CONTENT-DECLARATION.md</w:t>
+      </w:r>
+    </w:p>
+    <w:p>
+      <w:pPr>
+        <w:pStyle w:val="ListBullet"/>
+      </w:pPr>
+      <w:r>
+        <w:t>DEMO-INSTRUCTIONS.docx: https://github.com/AndrewConniff/GuitarSales/blob/main/DEMO-INSTRUCTIONS.docx</w:t>
+      </w:r>
+    </w:p>
+    <w:p>
+      <w:pPr>
+        <w:pStyle w:val="ListBullet"/>
+      </w:pPr>
+      <w:r>
+        <w:t>DEMO-INSTRUCTIONS.md: https://github.com/AndrewConniff/GuitarSales/blob/main/DEMO-INSTRUCTIONS.md</w:t>
+      </w:r>
+    </w:p>
+    <w:p>
+      <w:pPr>
+        <w:pStyle w:val="ListBullet"/>
+      </w:pPr>
+      <w:r>
+        <w:t>LICENSE: https://github.com/AndrewConniff/GuitarSales/blob/main/LICENSE</w:t>
+      </w:r>
+    </w:p>
+    <w:p>
+      <w:pPr>
+        <w:pStyle w:val="ListBullet"/>
+      </w:pPr>
+      <w:r>
+        <w:t>README.md: https://github.com/AndrewConniff/GuitarSales/blob/main/README.md</w:t>
+      </w:r>
+    </w:p>
+    <w:p>
+      <w:pPr>
+        <w:pStyle w:val="ListBullet"/>
+      </w:pPr>
+      <w:r>
+        <w:t>artifacts/Northstar_Acoustic_Works_Sales_Dashboard_Template.xlsx: https://github.com/AndrewConniff/GuitarSales/blob/main/artifacts/Northstar_Acoustic_Works_Sales_Dashboard_Template.xlsx</w:t>
+      </w:r>
+    </w:p>
+    <w:p>
+      <w:pPr>
+        <w:pStyle w:val="ListBullet"/>
+      </w:pPr>
+      <w:r>
+        <w:t>artifacts/Northstar_GuitarSales_Meeting_Deck.pptx: https://github.com/AndrewConniff/GuitarSales/blob/main/artifacts/Northstar_GuitarSales_Meeting_Deck.pptx</w:t>
+      </w:r>
+    </w:p>
+    <w:p>
+      <w:pPr>
+        <w:pStyle w:val="ListBullet"/>
+      </w:pPr>
+      <w:r>
+        <w:t>artifacts/Northstar_Product_Build_Guidelines.docx: https://github.com/AndrewConniff/GuitarSales/blob/main/artifacts/Northstar_Product_Build_Guidelines.docx</w:t>
+      </w:r>
+    </w:p>
+    <w:p>
+      <w:pPr>
+        <w:pStyle w:val="ListBullet"/>
+      </w:pPr>
+      <w:r>
+        <w:t>artifacts/Northstar_Sales_Brief_Template.docx: https://github.com/AndrewConniff/GuitarSales/blob/main/artifacts/Northstar_Sales_Brief_Template.docx</w:t>
+      </w:r>
+    </w:p>
+    <w:p>
+      <w:pPr>
+        <w:pStyle w:val="ListBullet"/>
+      </w:pPr>
+      <w:r>
+        <w:t>artifacts/Northstar_Shop_Accident_Response_SOP.docx: https://github.com/AndrewConniff/GuitarSales/blob/main/artifacts/Northstar_Shop_Accident_Response_SOP.docx</w:t>
+      </w:r>
+    </w:p>
+    <w:p>
+      <w:pPr>
+        <w:pStyle w:val="ListBullet"/>
+      </w:pPr>
+      <w:r>
+        <w:t>artifacts/Northstar_Wood_Supplies_Availability.xlsx: https://github.com/AndrewConniff/GuitarSales/blob/main/artifacts/Northstar_Wood_Supplies_Availability.xlsx</w:t>
+      </w:r>
+    </w:p>
+    <w:p>
+      <w:pPr>
+        <w:pStyle w:val="ListBullet"/>
+      </w:pPr>
+      <w:r>
+        <w:t>sample-data/all_regions_sales.csv: https://github.com/AndrewConniff/GuitarSales/blob/main/sample-data/all_regions_sales.csv</w:t>
+      </w:r>
+    </w:p>
+    <w:p>
+      <w:pPr>
+        <w:pStyle w:val="ListBullet"/>
+      </w:pPr>
+      <w:r>
+        <w:t>sample-data/midwest_regional_sales.csv: https://github.com/AndrewConniff/GuitarSales/blob/main/sample-data/midwest_regional_sales.csv</w:t>
+      </w:r>
+    </w:p>
+    <w:p>
+      <w:pPr>
+        <w:pStyle w:val="ListBullet"/>
+      </w:pPr>
+      <w:r>
+        <w:t>sample-data/midwest_regional_sales.xlsx: https://github.com/AndrewConniff/GuitarSales/blob/main/sample-data/midwest_regional_sales.xlsx</w:t>
+      </w:r>
+    </w:p>
+    <w:p>
+      <w:pPr>
+        <w:pStyle w:val="ListBullet"/>
+      </w:pPr>
+      <w:r>
+        <w:t>sample-data/northeast_regional_sales.csv: https://github.com/AndrewConniff/GuitarSales/blob/main/sample-data/northeast_regional_sales.csv</w:t>
+      </w:r>
+    </w:p>
+    <w:p>
+      <w:pPr>
+        <w:pStyle w:val="ListBullet"/>
+      </w:pPr>
+      <w:r>
+        <w:t>sample-data/northeast_regional_sales.xlsx: https://github.com/AndrewConniff/GuitarSales/blob/main/sample-data/northeast_regional_sales.xlsx</w:t>
+      </w:r>
+    </w:p>
+    <w:p>
+      <w:pPr>
+        <w:pStyle w:val="ListBullet"/>
+      </w:pPr>
+      <w:r>
+        <w:t>sample-data/southeast_regional_sales.csv: https://github.com/AndrewConniff/GuitarSales/blob/main/sample-data/southeast_regional_sales.csv</w:t>
+      </w:r>
+    </w:p>
+    <w:p>
+      <w:pPr>
+        <w:pStyle w:val="ListBullet"/>
+      </w:pPr>
+      <w:r>
+        <w:t>sample-data/southeast_regional_sales.xlsx: https://github.com/AndrewConniff/GuitarSales/blob/main/sample-data/southeast_regional_sales.xlsx</w:t>
+      </w:r>
+    </w:p>
+    <w:p>
+      <w:pPr>
+        <w:pStyle w:val="ListBullet"/>
+      </w:pPr>
+      <w:r>
+        <w:t>sample-data/southwest_regional_sales.csv: https://github.com/AndrewConniff/GuitarSales/blob/main/sample-data/southwest_regional_sales.csv</w:t>
+      </w:r>
+    </w:p>
+    <w:p>
+      <w:pPr>
+        <w:pStyle w:val="ListBullet"/>
+      </w:pPr>
+      <w:r>
+        <w:t>sample-data/southwest_regional_sales.xlsx: https://github.com/AndrewConniff/GuitarSales/blob/main/sample-data/southwest_regional_sales.xlsx</w:t>
+      </w:r>
+    </w:p>
+    <w:p>
+      <w:pPr>
+        <w:pStyle w:val="ListBullet"/>
+      </w:pPr>
+      <w:r>
+        <w:t>sample-data/west_regional_sales.csv: https://github.com/AndrewConniff/GuitarSales/blob/main/sample-data/west_regional_sales.csv</w:t>
+      </w:r>
+    </w:p>
+    <w:p>
+      <w:pPr>
+        <w:pStyle w:val="ListBullet"/>
+      </w:pPr>
+      <w:r>
+        <w:t>sample-data/west_regional_sales.xlsx: https://github.com/AndrewConniff/GuitarSales/blob/main/sample-data/west_regional_sales.xlsx</w:t>
+      </w:r>
+    </w:p>
+    <w:p>
+      <w:pPr>
+        <w:pStyle w:val="ListBullet"/>
+      </w:pPr>
+      <w:r>
+        <w:t>setup/agent_setup_notes.md: https://github.com/AndrewConniff/GuitarSales/blob/main/setup/agent_setup_notes.md</w:t>
+      </w:r>
+    </w:p>
+    <w:p>
+      <w:pPr>
+        <w:pStyle w:val="ListBullet"/>
+      </w:pPr>
+      <w:r>
+        <w:t>setup/chat_build_planning_agent_config.json: https://github.com/AndrewConniff/GuitarSales/blob/main/setup/chat_build_planning_agent_config.json</w:t>
+      </w:r>
+    </w:p>
+    <w:p>
+      <w:pPr>
+        <w:pStyle w:val="ListBullet"/>
+      </w:pPr>
+      <w:r>
+        <w:t>setup/sharepoint_safety_agent_config.json: https://github.com/AndrewConniff/GuitarSales/blob/main/setup/sharepoint_safety_agent_config.json</w:t>
+      </w:r>
+    </w:p>
     <w:sectPr>
       <w:pgSz w:w="12240" w:h="15840"/>
       <w:pgMar w:top="1440" w:right="1800" w:bottom="1440" w:left="1800" w:header="720" w:footer="720" w:gutter="0"/>

</xml_diff>